<commit_message>
commit at 3:43 pm 4-6-26
</commit_message>
<xml_diff>
--- a/Git.docx
+++ b/Git.docx
@@ -405,10 +405,272 @@
         <w:rPr>
           <w:lang w:val="en-US"/>
         </w:rPr>
-        <w:t>To change drive we will use cd /drivename</w:t>
+        <w:t>To change drive we will use cd /</w:t>
+      </w:r>
+      <w:proofErr w:type="spellStart"/>
+      <w:r>
+        <w:rPr>
+          <w:lang w:val="en-US"/>
+        </w:rPr>
+        <w:t>drivename</w:t>
+      </w:r>
+      <w:proofErr w:type="spellEnd"/>
+    </w:p>
+    <w:p>
+      <w:pPr>
+        <w:rPr>
+          <w:lang w:val="en-US"/>
+        </w:rPr>
+      </w:pPr>
+    </w:p>
+    <w:p>
+      <w:pPr>
+        <w:rPr>
+          <w:lang w:val="en-US"/>
+        </w:rPr>
+      </w:pPr>
+      <w:r>
+        <w:rPr>
+          <w:lang w:val="en-US"/>
+        </w:rPr>
+        <w:t>.</w:t>
+      </w:r>
+      <w:proofErr w:type="spellStart"/>
+      <w:r>
+        <w:rPr>
+          <w:lang w:val="en-US"/>
+        </w:rPr>
+        <w:t>gitignore</w:t>
+      </w:r>
+      <w:proofErr w:type="spellEnd"/>
+      <w:r>
+        <w:rPr>
+          <w:lang w:val="en-US"/>
+        </w:rPr>
+        <w:t xml:space="preserve"> </w:t>
+      </w:r>
+    </w:p>
+    <w:p>
+      <w:pPr>
+        <w:rPr>
+          <w:lang w:val="en-US"/>
+        </w:rPr>
+      </w:pPr>
+      <w:proofErr w:type="spellStart"/>
+      <w:r>
+        <w:rPr>
+          <w:lang w:val="en-US"/>
+        </w:rPr>
+        <w:t>Dist</w:t>
+      </w:r>
+      <w:proofErr w:type="spellEnd"/>
+      <w:r>
+        <w:rPr>
+          <w:lang w:val="en-US"/>
+        </w:rPr>
+        <w:t xml:space="preserve">/ .exe, .war, .final output file </w:t>
+      </w:r>
+    </w:p>
+    <w:p>
+      <w:pPr>
+        <w:rPr>
+          <w:lang w:val="en-US"/>
+        </w:rPr>
+      </w:pPr>
+      <w:proofErr w:type="spellStart"/>
+      <w:r>
+        <w:rPr>
+          <w:lang w:val="en-US"/>
+        </w:rPr>
+        <w:t>React_prj</w:t>
+      </w:r>
+      <w:proofErr w:type="spellEnd"/>
+    </w:p>
+    <w:p>
+      <w:pPr>
+        <w:rPr>
+          <w:lang w:val="en-US"/>
+        </w:rPr>
+      </w:pPr>
+      <w:r>
+        <w:rPr>
+          <w:lang w:val="en-US"/>
+        </w:rPr>
+        <w:t xml:space="preserve">   </w:t>
+      </w:r>
+      <w:proofErr w:type="spellStart"/>
+      <w:r>
+        <w:rPr>
+          <w:lang w:val="en-US"/>
+        </w:rPr>
+        <w:t>Node_modules</w:t>
+      </w:r>
+      <w:proofErr w:type="spellEnd"/>
+      <w:r>
+        <w:rPr>
+          <w:lang w:val="en-US"/>
+        </w:rPr>
+        <w:t xml:space="preserve"> </w:t>
+      </w:r>
+    </w:p>
+    <w:p>
+      <w:pPr>
+        <w:rPr>
+          <w:lang w:val="en-US"/>
+        </w:rPr>
+      </w:pPr>
+      <w:r>
+        <w:rPr>
+          <w:lang w:val="en-US"/>
+        </w:rPr>
+        <w:t xml:space="preserve"> .</w:t>
+      </w:r>
+      <w:proofErr w:type="spellStart"/>
+      <w:r>
+        <w:rPr>
+          <w:lang w:val="en-US"/>
+        </w:rPr>
+        <w:t>gitignore</w:t>
+      </w:r>
+      <w:proofErr w:type="spellEnd"/>
+      <w:r>
+        <w:rPr>
+          <w:lang w:val="en-US"/>
+        </w:rPr>
+        <w:t xml:space="preserve"> </w:t>
+      </w:r>
+    </w:p>
+    <w:p>
+      <w:pPr>
+        <w:rPr>
+          <w:lang w:val="en-US"/>
+        </w:rPr>
+      </w:pPr>
+    </w:p>
+    <w:p>
+      <w:pPr>
+        <w:rPr>
+          <w:lang w:val="en-US"/>
+        </w:rPr>
+      </w:pPr>
+      <w:r>
+        <w:rPr>
+          <w:lang w:val="en-US"/>
+        </w:rPr>
+        <w:lastRenderedPageBreak/>
+        <w:t xml:space="preserve">Tracked and untracked file </w:t>
+      </w:r>
+    </w:p>
+    <w:p>
+      <w:pPr>
+        <w:rPr>
+          <w:lang w:val="en-US"/>
+        </w:rPr>
+      </w:pPr>
+      <w:r>
+        <w:rPr>
+          <w:lang w:val="en-US"/>
+        </w:rPr>
+        <w:t xml:space="preserve">Staging </w:t>
+      </w:r>
+    </w:p>
+    <w:p>
+      <w:pPr>
+        <w:rPr>
+          <w:lang w:val="en-US"/>
+        </w:rPr>
+      </w:pPr>
+      <w:r>
+        <w:rPr>
+          <w:lang w:val="en-US"/>
+        </w:rPr>
+        <w:t xml:space="preserve">Commit </w:t>
+      </w:r>
+    </w:p>
+    <w:p>
+      <w:pPr>
+        <w:rPr>
+          <w:lang w:val="en-US"/>
+        </w:rPr>
+      </w:pPr>
+      <w:proofErr w:type="spellStart"/>
+      <w:r>
+        <w:rPr>
+          <w:lang w:val="en-US"/>
+        </w:rPr>
+        <w:t>Git</w:t>
+      </w:r>
+      <w:proofErr w:type="spellEnd"/>
+      <w:r>
+        <w:rPr>
+          <w:lang w:val="en-US"/>
+        </w:rPr>
+        <w:t xml:space="preserve"> status </w:t>
+      </w:r>
+    </w:p>
+    <w:p>
+      <w:pPr>
+        <w:rPr>
+          <w:lang w:val="en-US"/>
+        </w:rPr>
+      </w:pPr>
+      <w:proofErr w:type="spellStart"/>
+      <w:r>
+        <w:rPr>
+          <w:lang w:val="en-US"/>
+        </w:rPr>
+        <w:t>Git</w:t>
+      </w:r>
+      <w:proofErr w:type="spellEnd"/>
+      <w:r>
+        <w:rPr>
+          <w:lang w:val="en-US"/>
+        </w:rPr>
+        <w:t xml:space="preserve"> log </w:t>
+      </w:r>
+    </w:p>
+    <w:p>
+      <w:pPr>
+        <w:rPr>
+          <w:lang w:val="en-US"/>
+        </w:rPr>
+      </w:pPr>
+      <w:proofErr w:type="spellStart"/>
+      <w:r>
+        <w:rPr>
+          <w:lang w:val="en-US"/>
+        </w:rPr>
+        <w:t>Git</w:t>
+      </w:r>
+      <w:proofErr w:type="spellEnd"/>
+      <w:r>
+        <w:rPr>
+          <w:lang w:val="en-US"/>
+        </w:rPr>
+        <w:t xml:space="preserve"> commit –m “</w:t>
+      </w:r>
+      <w:proofErr w:type="spellStart"/>
+      <w:r>
+        <w:rPr>
+          <w:lang w:val="en-US"/>
+        </w:rPr>
+        <w:t>msg</w:t>
+      </w:r>
+      <w:proofErr w:type="spellEnd"/>
+      <w:r>
+        <w:rPr>
+          <w:lang w:val="en-US"/>
+        </w:rPr>
+        <w:t xml:space="preserve"> when we are doing any commit</w:t>
       </w:r>
       <w:bookmarkStart w:id="0" w:name="_GoBack"/>
       <w:bookmarkEnd w:id="0"/>
+      <w:r>
+        <w:rPr>
+          <w:lang w:val="en-US"/>
+        </w:rPr>
+        <w:t>”</w:t>
+      </w:r>
     </w:p>
     <w:sectPr>
       <w:pgSz w:w="11906" w:h="16838"/>

</xml_diff>